<commit_message>
Ajusta mão de obra semanal da Sem. 36 conforme apresentação
Co-Authored-By: Claude Opus 5.5 <noreply@anthropic.com>
Claude-Session: https://claude.ai/code/session_01FB4jxXQnS64EaPi8f1X4cP
</commit_message>
<xml_diff>
--- a/Relatório Semanal Dedini - SEM. 36 - Tanques de Água - Campo Novo do Parecis (atualizado).docx
+++ b/Relatório Semanal Dedini - SEM. 36 - Tanques de Água - Campo Novo do Parecis (atualizado).docx
@@ -11371,7 +11371,7 @@
                 <w:sz w:val="24"/>
                 <w:szCs w:val="24"/>
               </w:rPr>
-              <w:t>27</w:t>
+              <w:t>21</w:t>
             </w:r>
           </w:p>
         </w:tc>
@@ -11413,7 +11413,7 @@
                 <w:sz w:val="24"/>
                 <w:szCs w:val="24"/>
               </w:rPr>
-              <w:t>00</w:t>
+              <w:t>05</w:t>
             </w:r>
           </w:p>
         </w:tc>
@@ -11534,7 +11534,7 @@
                 <w:sz w:val="24"/>
                 <w:szCs w:val="24"/>
               </w:rPr>
-              <w:t>12</w:t>
+              <w:t>11</w:t>
             </w:r>
           </w:p>
         </w:tc>
@@ -11576,7 +11576,7 @@
                 <w:sz w:val="24"/>
                 <w:szCs w:val="24"/>
               </w:rPr>
-              <w:t>00</w:t>
+              <w:t>05</w:t>
             </w:r>
           </w:p>
         </w:tc>
@@ -11697,7 +11697,7 @@
                 <w:sz w:val="24"/>
                 <w:szCs w:val="24"/>
               </w:rPr>
-              <w:t>39</w:t>
+              <w:t>32</w:t>
             </w:r>
           </w:p>
         </w:tc>
@@ -11739,7 +11739,7 @@
                 <w:sz w:val="24"/>
                 <w:szCs w:val="24"/>
               </w:rPr>
-              <w:t>00</w:t>
+              <w:t>10</w:t>
             </w:r>
           </w:p>
         </w:tc>

</xml_diff>

<commit_message>
Atualiza gráficos de histograma com dados da apresentação
Co-Authored-By: Claude Opus 5.5 <noreply@anthropic.com>
Claude-Session: https://claude.ai/code/session_01FB4jxXQnS64EaPi8f1X4cP
</commit_message>
<xml_diff>
--- a/Relatório Semanal Dedini - SEM. 36 - Tanques de Água - Campo Novo do Parecis (atualizado).docx
+++ b/Relatório Semanal Dedini - SEM. 36 - Tanques de Água - Campo Novo do Parecis (atualizado).docx
@@ -18701,112 +18701,112 @@
                 <c:formatCode>0</c:formatCode>
                 <c:ptCount val="36"/>
                 <c:pt idx="0">
-                  <c:v>10</c:v>
+                  <c:v>5</c:v>
                 </c:pt>
                 <c:pt idx="1">
-                  <c:v>11</c:v>
+                  <c:v>5</c:v>
                 </c:pt>
                 <c:pt idx="2">
-                  <c:v>13</c:v>
+                  <c:v>9</c:v>
                 </c:pt>
                 <c:pt idx="3">
-                  <c:v>18</c:v>
+                  <c:v>9</c:v>
                 </c:pt>
                 <c:pt idx="4">
-                  <c:v>22</c:v>
+                  <c:v>23</c:v>
                 </c:pt>
                 <c:pt idx="5">
-                  <c:v>26</c:v>
+                  <c:v>23</c:v>
                 </c:pt>
                 <c:pt idx="6">
-                  <c:v>32</c:v>
+                  <c:v>25</c:v>
                 </c:pt>
                 <c:pt idx="7">
-                  <c:v>32</c:v>
+                  <c:v>25</c:v>
                 </c:pt>
                 <c:pt idx="8">
-                  <c:v>38</c:v>
+                  <c:v>25</c:v>
                 </c:pt>
                 <c:pt idx="9">
-                  <c:v>40</c:v>
+                  <c:v>29</c:v>
                 </c:pt>
                 <c:pt idx="10">
-                  <c:v>47</c:v>
+                  <c:v>29</c:v>
                 </c:pt>
                 <c:pt idx="11">
-                  <c:v>47</c:v>
+                  <c:v>29</c:v>
                 </c:pt>
                 <c:pt idx="12">
-                  <c:v>49</c:v>
+                  <c:v>29</c:v>
                 </c:pt>
                 <c:pt idx="13">
-                  <c:v>51</c:v>
+                  <c:v>29</c:v>
                 </c:pt>
                 <c:pt idx="14">
-                  <c:v>51</c:v>
+                  <c:v>29</c:v>
                 </c:pt>
                 <c:pt idx="15">
-                  <c:v>54</c:v>
+                  <c:v>29</c:v>
                 </c:pt>
                 <c:pt idx="16">
-                  <c:v>54</c:v>
+                  <c:v>29</c:v>
                 </c:pt>
                 <c:pt idx="17">
-                  <c:v>54</c:v>
+                  <c:v>29</c:v>
                 </c:pt>
                 <c:pt idx="18">
-                  <c:v>54</c:v>
+                  <c:v>29</c:v>
                 </c:pt>
                 <c:pt idx="19">
-                  <c:v>54</c:v>
+                  <c:v>29</c:v>
                 </c:pt>
                 <c:pt idx="20">
-                  <c:v>54</c:v>
+                  <c:v>29</c:v>
                 </c:pt>
                 <c:pt idx="21">
-                  <c:v>54</c:v>
+                  <c:v>29</c:v>
                 </c:pt>
                 <c:pt idx="22">
-                  <c:v>54</c:v>
+                  <c:v>29</c:v>
                 </c:pt>
                 <c:pt idx="23">
-                  <c:v>54</c:v>
+                  <c:v>29</c:v>
                 </c:pt>
                 <c:pt idx="24">
-                  <c:v>54</c:v>
+                  <c:v>29</c:v>
                 </c:pt>
                 <c:pt idx="25">
-                  <c:v>54</c:v>
+                  <c:v>21</c:v>
                 </c:pt>
                 <c:pt idx="26">
-                  <c:v>47</c:v>
+                  <c:v>21</c:v>
                 </c:pt>
                 <c:pt idx="27">
-                  <c:v>47</c:v>
+                  <c:v>21</c:v>
                 </c:pt>
                 <c:pt idx="28">
-                  <c:v>45</c:v>
+                  <c:v>21</c:v>
                 </c:pt>
                 <c:pt idx="29">
-                  <c:v>40</c:v>
+                  <c:v>21</c:v>
                 </c:pt>
                 <c:pt idx="30">
-                  <c:v>37</c:v>
+                  <c:v>21</c:v>
                 </c:pt>
                 <c:pt idx="31">
-                  <c:v>35</c:v>
+                  <c:v>21</c:v>
                 </c:pt>
                 <c:pt idx="32">
-                  <c:v>27</c:v>
+                  <c:v>21</c:v>
                 </c:pt>
                 <c:pt idx="33">
-                  <c:v>27</c:v>
+                  <c:v>21</c:v>
                 </c:pt>
                 <c:pt idx="34">
-                  <c:v>27</c:v>
+                  <c:v>21</c:v>
                 </c:pt>
                 <c:pt idx="35">
-                  <c:v>27</c:v>
+                  <c:v>21</c:v>
                 </c:pt>
               </c:numCache>
             </c:numRef>
@@ -19070,64 +19070,64 @@
                   <c:v>37</c:v>
                 </c:pt>
                 <c:pt idx="16">
-                  <c:v>41</c:v>
+                  <c:v>45</c:v>
                 </c:pt>
                 <c:pt idx="17">
-                  <c:v>41</c:v>
+                  <c:v>45</c:v>
                 </c:pt>
                 <c:pt idx="18">
-                  <c:v>49</c:v>
+                  <c:v>55</c:v>
                 </c:pt>
                 <c:pt idx="19">
-                  <c:v>49</c:v>
+                  <c:v>55</c:v>
                 </c:pt>
                 <c:pt idx="20">
-                  <c:v>52</c:v>
+                  <c:v>58</c:v>
                 </c:pt>
                 <c:pt idx="21">
-                  <c:v>52</c:v>
+                  <c:v>58</c:v>
                 </c:pt>
                 <c:pt idx="22">
-                  <c:v>52</c:v>
+                  <c:v>58</c:v>
                 </c:pt>
                 <c:pt idx="23">
-                  <c:v>54</c:v>
+                  <c:v>58</c:v>
                 </c:pt>
                 <c:pt idx="24">
+                  <c:v>63</c:v>
+                </c:pt>
+                <c:pt idx="25">
+                  <c:v>63</c:v>
+                </c:pt>
+                <c:pt idx="26">
+                  <c:v>62</c:v>
+                </c:pt>
+                <c:pt idx="27">
                   <c:v>57</c:v>
                 </c:pt>
-                <c:pt idx="25">
+                <c:pt idx="28">
                   <c:v>57</c:v>
                 </c:pt>
-                <c:pt idx="26">
-                  <c:v>56</c:v>
-                </c:pt>
-                <c:pt idx="27">
-                  <c:v>56</c:v>
-                </c:pt>
-                <c:pt idx="28">
-                  <c:v>53</c:v>
-                </c:pt>
                 <c:pt idx="29">
-                  <c:v>45</c:v>
+                  <c:v>55</c:v>
                 </c:pt>
                 <c:pt idx="30">
-                  <c:v>20</c:v>
+                  <c:v>29</c:v>
                 </c:pt>
                 <c:pt idx="31">
-                  <c:v>11</c:v>
+                  <c:v>17</c:v>
                 </c:pt>
                 <c:pt idx="32">
-                  <c:v>9</c:v>
+                  <c:v>13</c:v>
                 </c:pt>
                 <c:pt idx="33">
-                  <c:v>0</c:v>
+                  <c:v>10</c:v>
                 </c:pt>
                 <c:pt idx="34">
-                  <c:v>0</c:v>
+                  <c:v>5</c:v>
                 </c:pt>
                 <c:pt idx="35">
-                  <c:v>0</c:v>
+                  <c:v>5</c:v>
                 </c:pt>
               </c:numCache>
             </c:numRef>
@@ -19439,7 +19439,7 @@
                 <c:formatCode>0</c:formatCode>
                 <c:ptCount val="36"/>
                 <c:pt idx="0">
-                  <c:v>8</c:v>
+                  <c:v>7</c:v>
                 </c:pt>
                 <c:pt idx="1">
                   <c:v>8</c:v>
@@ -19448,103 +19448,103 @@
                   <c:v>8</c:v>
                 </c:pt>
                 <c:pt idx="3">
-                  <c:v>10</c:v>
+                  <c:v>8</c:v>
                 </c:pt>
                 <c:pt idx="4">
-                  <c:v>10</c:v>
+                  <c:v>8</c:v>
                 </c:pt>
                 <c:pt idx="5">
-                  <c:v>10</c:v>
+                  <c:v>8</c:v>
                 </c:pt>
                 <c:pt idx="6">
-                  <c:v>13</c:v>
+                  <c:v>9</c:v>
                 </c:pt>
                 <c:pt idx="7">
-                  <c:v>13</c:v>
+                  <c:v>9</c:v>
                 </c:pt>
                 <c:pt idx="8">
-                  <c:v>14</c:v>
+                  <c:v>11</c:v>
                 </c:pt>
                 <c:pt idx="9">
-                  <c:v>14</c:v>
+                  <c:v>11</c:v>
                 </c:pt>
                 <c:pt idx="10">
-                  <c:v>14</c:v>
+                  <c:v>11</c:v>
                 </c:pt>
                 <c:pt idx="11">
-                  <c:v>14</c:v>
+                  <c:v>11</c:v>
                 </c:pt>
                 <c:pt idx="12">
-                  <c:v>14</c:v>
+                  <c:v>11</c:v>
                 </c:pt>
                 <c:pt idx="13">
-                  <c:v>14</c:v>
+                  <c:v>11</c:v>
                 </c:pt>
                 <c:pt idx="14">
-                  <c:v>14</c:v>
+                  <c:v>11</c:v>
                 </c:pt>
                 <c:pt idx="15">
-                  <c:v>14</c:v>
+                  <c:v>11</c:v>
                 </c:pt>
                 <c:pt idx="16">
-                  <c:v>14</c:v>
+                  <c:v>11</c:v>
                 </c:pt>
                 <c:pt idx="17">
-                  <c:v>14</c:v>
+                  <c:v>11</c:v>
                 </c:pt>
                 <c:pt idx="18">
-                  <c:v>14</c:v>
+                  <c:v>11</c:v>
                 </c:pt>
                 <c:pt idx="19">
-                  <c:v>14</c:v>
+                  <c:v>11</c:v>
                 </c:pt>
                 <c:pt idx="20">
-                  <c:v>14</c:v>
+                  <c:v>11</c:v>
                 </c:pt>
                 <c:pt idx="21">
-                  <c:v>14</c:v>
+                  <c:v>11</c:v>
                 </c:pt>
                 <c:pt idx="22">
-                  <c:v>14</c:v>
+                  <c:v>11</c:v>
                 </c:pt>
                 <c:pt idx="23">
-                  <c:v>14</c:v>
+                  <c:v>11</c:v>
                 </c:pt>
                 <c:pt idx="24">
-                  <c:v>14</c:v>
+                  <c:v>11</c:v>
                 </c:pt>
                 <c:pt idx="25">
-                  <c:v>14</c:v>
+                  <c:v>11</c:v>
                 </c:pt>
                 <c:pt idx="26">
-                  <c:v>14</c:v>
+                  <c:v>11</c:v>
                 </c:pt>
                 <c:pt idx="27">
-                  <c:v>14</c:v>
+                  <c:v>11</c:v>
                 </c:pt>
                 <c:pt idx="28">
-                  <c:v>12</c:v>
+                  <c:v>11</c:v>
                 </c:pt>
                 <c:pt idx="29">
-                  <c:v>12</c:v>
+                  <c:v>11</c:v>
                 </c:pt>
                 <c:pt idx="30">
-                  <c:v>12</c:v>
+                  <c:v>11</c:v>
                 </c:pt>
                 <c:pt idx="31">
-                  <c:v>12</c:v>
+                  <c:v>11</c:v>
                 </c:pt>
                 <c:pt idx="32">
-                  <c:v>12</c:v>
+                  <c:v>11</c:v>
                 </c:pt>
                 <c:pt idx="33">
-                  <c:v>12</c:v>
+                  <c:v>11</c:v>
                 </c:pt>
                 <c:pt idx="34">
-                  <c:v>12</c:v>
+                  <c:v>11</c:v>
                 </c:pt>
                 <c:pt idx="35">
-                  <c:v>12</c:v>
+                  <c:v>11</c:v>
                 </c:pt>
               </c:numCache>
             </c:numRef>
@@ -19760,7 +19760,7 @@
               <c:f>Histograma_MOI!$D$36:$AQ$36</c:f>
               <c:numCache>
                 <c:formatCode>0</c:formatCode>
-                <c:ptCount val="36"/>
+                <c:ptCount val="40"/>
                 <c:pt idx="0">
                   <c:v>7</c:v>
                 </c:pt>
@@ -19828,45 +19828,57 @@
                   <c:v>20</c:v>
                 </c:pt>
                 <c:pt idx="22">
-                  <c:v>19</c:v>
+                  <c:v>18</c:v>
                 </c:pt>
                 <c:pt idx="23">
-                  <c:v>19</c:v>
+                  <c:v>18</c:v>
                 </c:pt>
                 <c:pt idx="24">
-                  <c:v>21</c:v>
+                  <c:v>20</c:v>
                 </c:pt>
                 <c:pt idx="25">
                   <c:v>20</c:v>
                 </c:pt>
                 <c:pt idx="26">
-                  <c:v>20</c:v>
+                  <c:v>19</c:v>
                 </c:pt>
                 <c:pt idx="27">
-                  <c:v>20</c:v>
+                  <c:v>19</c:v>
                 </c:pt>
                 <c:pt idx="28">
-                  <c:v>20</c:v>
+                  <c:v>19</c:v>
                 </c:pt>
                 <c:pt idx="29">
-                  <c:v>15</c:v>
+                  <c:v>19</c:v>
                 </c:pt>
                 <c:pt idx="30">
-                  <c:v>11</c:v>
+                  <c:v>14</c:v>
                 </c:pt>
                 <c:pt idx="31">
-                  <c:v>9</c:v>
+                  <c:v>4</c:v>
                 </c:pt>
                 <c:pt idx="32">
-                  <c:v>9</c:v>
+                  <c:v>6</c:v>
                 </c:pt>
                 <c:pt idx="33">
-                  <c:v>6</c:v>
+                  <c:v>5</c:v>
                 </c:pt>
                 <c:pt idx="34">
                   <c:v>6</c:v>
                 </c:pt>
                 <c:pt idx="35">
+                  <c:v>5</c:v>
+                </c:pt>
+                <c:pt idx="36">
+                  <c:v>0</c:v>
+                </c:pt>
+                <c:pt idx="37">
+                  <c:v>0</c:v>
+                </c:pt>
+                <c:pt idx="38">
+                  <c:v>0</c:v>
+                </c:pt>
+                <c:pt idx="39">
                   <c:v>0</c:v>
                 </c:pt>
               </c:numCache>
@@ -20605,28 +20617,28 @@
                   <c:v>15</c:v>
                 </c:pt>
                 <c:pt idx="27">
-                  <c:v>15</c:v>
+                  <c:v>14</c:v>
                 </c:pt>
                 <c:pt idx="28">
-                  <c:v>14</c:v>
+                  <c:v>11</c:v>
                 </c:pt>
                 <c:pt idx="29">
-                  <c:v>10</c:v>
+                  <c:v>11</c:v>
                 </c:pt>
                 <c:pt idx="30">
-                  <c:v>6</c:v>
+                  <c:v>8</c:v>
                 </c:pt>
                 <c:pt idx="31">
-                  <c:v>5</c:v>
+                  <c:v>0</c:v>
                 </c:pt>
                 <c:pt idx="32">
-                  <c:v>4</c:v>
+                  <c:v>0</c:v>
                 </c:pt>
                 <c:pt idx="33">
-                  <c:v>3</c:v>
+                  <c:v>0</c:v>
                 </c:pt>
                 <c:pt idx="34">
-                  <c:v>5</c:v>
+                  <c:v>0</c:v>
                 </c:pt>
                 <c:pt idx="35">
                   <c:v>0</c:v>

</xml_diff>

<commit_message>
Limita série Real do histograma MOI às 36 semanas
Co-Authored-By: Claude Opus 5.5 <noreply@anthropic.com>
Claude-Session: https://claude.ai/code/session_01FB4jxXQnS64EaPi8f1X4cP
</commit_message>
<xml_diff>
--- a/Relatório Semanal Dedini - SEM. 36 - Tanques de Água - Campo Novo do Parecis (atualizado).docx
+++ b/Relatório Semanal Dedini - SEM. 36 - Tanques de Água - Campo Novo do Parecis (atualizado).docx
@@ -19760,7 +19760,7 @@
               <c:f>Histograma_MOI!$D$36:$AQ$36</c:f>
               <c:numCache>
                 <c:formatCode>0</c:formatCode>
-                <c:ptCount val="40"/>
+                <c:ptCount val="36"/>
                 <c:pt idx="0">
                   <c:v>7</c:v>
                 </c:pt>
@@ -19868,18 +19868,6 @@
                 </c:pt>
                 <c:pt idx="35">
                   <c:v>5</c:v>
-                </c:pt>
-                <c:pt idx="36">
-                  <c:v>0</c:v>
-                </c:pt>
-                <c:pt idx="37">
-                  <c:v>0</c:v>
-                </c:pt>
-                <c:pt idx="38">
-                  <c:v>0</c:v>
-                </c:pt>
-                <c:pt idx="39">
-                  <c:v>0</c:v>
                 </c:pt>
               </c:numCache>
             </c:numRef>

</xml_diff>